<commit_message>
addedd Lab 2 report outline
</commit_message>
<xml_diff>
--- a/Lab2/Lab 2_Report.docx
+++ b/Lab2/Lab 2_Report.docx
@@ -18,25 +18,7 @@
         <w:rPr>
           <w:rFonts w:ascii="Times Newer Roman" w:hAnsi="Times Newer Roman"/>
         </w:rPr>
-        <w:t xml:space="preserve">Lab </w:t>
-      </w:r>
-      <w:r>
-        <w:rPr>
-          <w:rFonts w:ascii="Times Newer Roman" w:hAnsi="Times Newer Roman"/>
-        </w:rPr>
-        <w:t>2</w:t>
-      </w:r>
-      <w:r>
-        <w:rPr>
-          <w:rFonts w:ascii="Times Newer Roman" w:hAnsi="Times Newer Roman"/>
-        </w:rPr>
-        <w:t xml:space="preserve">: </w:t>
-      </w:r>
-      <w:r>
-        <w:rPr>
-          <w:rFonts w:ascii="Times Newer Roman" w:hAnsi="Times Newer Roman"/>
-        </w:rPr>
-        <w:t>GNU Radio Tutorials</w:t>
+        <w:t>Lab 2: GNU Radio Tutorials</w:t>
       </w:r>
     </w:p>
     <w:p>
@@ -55,13 +37,7 @@
         <w:rPr>
           <w:rFonts w:ascii="Times Newer Roman" w:hAnsi="Times Newer Roman"/>
         </w:rPr>
-        <w:t>Zachary Witt</w:t>
-      </w:r>
-      <w:r>
-        <w:rPr>
-          <w:rFonts w:ascii="Times Newer Roman" w:hAnsi="Times Newer Roman"/>
-        </w:rPr>
-        <w:t xml:space="preserve"> &amp; Gilon Kraft</w:t>
+        <w:t>Zachary Witt &amp; Gilon Kraft</w:t>
       </w:r>
     </w:p>
     <w:p>
@@ -125,13 +101,7 @@
         <w:rPr>
           <w:rFonts w:ascii="Times Newer Roman" w:hAnsi="Times Newer Roman"/>
         </w:rPr>
-        <w:t>April 13</w:t>
-      </w:r>
-      <w:r>
-        <w:rPr>
-          <w:rFonts w:ascii="Times Newer Roman" w:hAnsi="Times Newer Roman"/>
-        </w:rPr>
-        <w:t>. 2026</w:t>
+        <w:t>April 13. 2026</w:t>
       </w:r>
     </w:p>
     <w:p>
@@ -142,13 +112,8 @@
         <w:lastRenderedPageBreak/>
         <w:t>Abstract</w:t>
       </w:r>
-    </w:p>
-    <w:p>
-      <w:pPr>
-        <w:pStyle w:val="Heading1"/>
-      </w:pPr>
       <w:r>
-        <w:t>Introduction</w:t>
+        <w:t>/Introduction</w:t>
       </w:r>
     </w:p>
     <w:p>

</xml_diff>